<commit_message>
Complete FraudShield Multi-Model NoSQL Project & Assignment Artifacts
</commit_message>
<xml_diff>
--- a/NoSQL_Project_Formate_Filled.docx
+++ b/NoSQL_Project_Formate_Filled.docx
@@ -245,17 +245,17 @@
               <w:rPr>
                 <w:sz w:val="20"/>
               </w:rPr>
-              <w:t>Student Name: [Student Name]</w:t>
-              <w:br/>
-              <w:t>Enrolment Number: [Enrolment Number]</w:t>
-              <w:br/>
-              <w:t>Section: [Section]</w:t>
-              <w:br/>
-              <w:t>Subject Name: NoSQL Databases / Advanced Database Management Systems</w:t>
-              <w:br/>
-              <w:t>Email Address: [student.email@university.edu]</w:t>
-              <w:br/>
-              <w:t>Contact No: [+91-XXXXXXXXXX]</w:t>
+              <w:t>Student Name: Sarthak Gupta</w:t>
+              <w:br/>
+              <w:t>Enrolment Number: 2427010032</w:t>
+              <w:br/>
+              <w:t>Section: Section J</w:t>
+              <w:br/>
+              <w:t>Subject Name: NoSQL Databases</w:t>
+              <w:br/>
+              <w:t>Email Address: sarthak.2005gupta@gmail.com</w:t>
+              <w:br/>
+              <w:t>Contact No: 9599301499</w:t>
             </w:r>
           </w:p>
         </w:tc>
@@ -2137,7 +2137,7 @@
               <w:br/>
               <w:t>• Testing &amp; Validation: PyTest, HTTPX</w:t>
               <w:br/>
-              <w:t>• Documentation &amp; Diagramming: Matplotlib, Python-Docx, ReportLab</w:t>
+              <w:t>• Documentation &amp; Diagramming: Matplotlib, Python-Docx, ReportLab, LaTeX</w:t>
             </w:r>
           </w:p>
         </w:tc>
@@ -2849,7 +2849,7 @@
           </w:tcPr>
           <w:p>
             <w:r>
-              <w:t>Signature: __________________________    Print name: [Student Name]    Date: September 25, 2026</w:t>
+              <w:t>Signature: __________________________    Print name: Sarthak Gupta    Date: September 25, 2026</w:t>
             </w:r>
           </w:p>
         </w:tc>
@@ -3152,7 +3152,7 @@
           </w:tcPr>
           <w:p>
             <w:r>
-              <w:t>[Student Name]</w:t>
+              <w:t>Sarthak Gupta</w:t>
             </w:r>
           </w:p>
         </w:tc>
@@ -3162,7 +3162,7 @@
           </w:tcPr>
           <w:p>
             <w:r>
-              <w:t>[Gender]</w:t>
+              <w:t>Male</w:t>
             </w:r>
           </w:p>
         </w:tc>
@@ -3182,7 +3182,7 @@
           </w:tcPr>
           <w:p>
             <w:r>
-              <w:t>[Campus Address]</w:t>
+              <w:t>Jaipur</w:t>
             </w:r>
           </w:p>
         </w:tc>

</xml_diff>